<commit_message>
Typo tweak in workbook
</commit_message>
<xml_diff>
--- a/Snails/Workshop2_snail_workbook2026.docx
+++ b/Snails/Workshop2_snail_workbook2026.docx
@@ -103,7 +103,15 @@
         <w:t>your r code to answer the questions on the following pages. Once you have completed this, please save it as a .pdf and submit it to FLO.</w:t>
       </w:r>
       <w:r>
-        <w:t xml:space="preserve"> Please answer all questions in full sentences. They don’t have to be long, but they have to be full sentences that could go straight into your results section!</w:t>
+        <w:t xml:space="preserve"> Please answer all questions in full sentences. They don’t have to be long, but they </w:t>
+      </w:r>
+      <w:proofErr w:type="gramStart"/>
+      <w:r>
+        <w:t>have to</w:t>
+      </w:r>
+      <w:proofErr w:type="gramEnd"/>
+      <w:r>
+        <w:t xml:space="preserve"> be full sentences that could go straight into your results section!</w:t>
       </w:r>
     </w:p>
     <w:p>
@@ -196,7 +204,39 @@
           <w:bCs/>
         </w:rPr>
         <w:lastRenderedPageBreak/>
-        <w:t xml:space="preserve">This time, you have to do a bit more of your own decision making. We’ll walk you through this in the CML, but here’s the decision making tree: </w:t>
+        <w:t xml:space="preserve">This time, you </w:t>
+      </w:r>
+      <w:proofErr w:type="gramStart"/>
+      <w:r>
+        <w:rPr>
+          <w:b/>
+          <w:bCs/>
+        </w:rPr>
+        <w:t>have to</w:t>
+      </w:r>
+      <w:proofErr w:type="gramEnd"/>
+      <w:r>
+        <w:rPr>
+          <w:b/>
+          <w:bCs/>
+        </w:rPr>
+        <w:t xml:space="preserve"> do a bit more of your own decision making. We’ll walk you through this in the CML, but here’s the </w:t>
+      </w:r>
+      <w:proofErr w:type="gramStart"/>
+      <w:r>
+        <w:rPr>
+          <w:b/>
+          <w:bCs/>
+        </w:rPr>
+        <w:t>decision making</w:t>
+      </w:r>
+      <w:proofErr w:type="gramEnd"/>
+      <w:r>
+        <w:rPr>
+          <w:b/>
+          <w:bCs/>
+        </w:rPr>
+        <w:t xml:space="preserve"> tree: </w:t>
       </w:r>
     </w:p>
     <w:p>
@@ -1470,10 +1510,12 @@
               <w:ind w:left="0"/>
             </w:pPr>
             <w:bookmarkStart w:id="0" w:name="_Int_Eyx3Zj38"/>
+            <w:proofErr w:type="spellStart"/>
             <w:r>
               <w:t>df</w:t>
             </w:r>
             <w:bookmarkEnd w:id="0"/>
+            <w:proofErr w:type="spellEnd"/>
           </w:p>
         </w:tc>
         <w:tc>
@@ -1747,10 +1789,28 @@
         <w:t xml:space="preserve"> elements of the plot</w:t>
       </w:r>
       <w:r>
-        <w:t xml:space="preserve">. This means entering four different commands for different modifications (i.e. it is not enough to change the colour of letters, points, lines and background repeating the same command) </w:t>
-      </w:r>
-      <w:r>
-        <w:tab/>
+        <w:t>. This means entering four different commands for different modifications (i.e. it is not enough to change the colour of letters, points, lines and background repeating the same command)</w:t>
+      </w:r>
+      <w:r>
+        <w:t xml:space="preserve">. You’re allowed to use AI to help you find nice plot additions – but it is </w:t>
+      </w:r>
+      <w:r>
+        <w:rPr>
+          <w:b/>
+          <w:bCs/>
+          <w:color w:val="FF0000"/>
+        </w:rPr>
+        <w:t>not permitted</w:t>
+      </w:r>
+      <w:r>
+        <w:rPr>
+          <w:b/>
+          <w:bCs/>
+        </w:rPr>
+        <w:t xml:space="preserve"> </w:t>
+      </w:r>
+      <w:r>
+        <w:t>to let AI write your whole plotting code!</w:t>
       </w:r>
       <w:r>
         <w:tab/>
@@ -1810,7 +1870,15 @@
         <w:t>Copy and paste your finished code</w:t>
       </w:r>
       <w:r>
-        <w:t xml:space="preserve"> (from Rstudio – not the console output)</w:t>
+        <w:t xml:space="preserve"> (from </w:t>
+      </w:r>
+      <w:proofErr w:type="spellStart"/>
+      <w:r>
+        <w:t>Rstudio</w:t>
+      </w:r>
+      <w:proofErr w:type="spellEnd"/>
+      <w:r>
+        <w:t xml:space="preserve"> – not the console output)</w:t>
       </w:r>
       <w:r>
         <w:t xml:space="preserve"> below.</w:t>

</xml_diff>